<commit_message>
Updated the SPM Problem Project proposal
</commit_message>
<xml_diff>
--- a/Project Proposal/SPM Problem Project Proposal.docx
+++ b/Project Proposal/SPM Problem Project Proposal.docx
@@ -710,7 +710,7 @@
           <w:numId w:val="2"/>
         </w:numPr>
         <w:rPr>
-          <w:rFonts w:asciiTheme="minorHAnsi" w:hAnsiTheme="minorHAnsi" w:cstheme="minorHAnsi"/>
+          <w:rFonts w:cstheme="minorHAnsi"/>
         </w:rPr>
       </w:pPr>
       <w:r>
@@ -725,7 +725,50 @@
         <w:rPr>
           <w:rFonts w:asciiTheme="minorHAnsi" w:hAnsiTheme="minorHAnsi" w:cstheme="minorHAnsi"/>
         </w:rPr>
-        <w:t xml:space="preserve"> Occupational and technical qualifications require students to complete mandatory practical workplace hours, workshops, and portfolio submissions before qualifying for final external summative assessments. Currently, tracking these milestones relies heavily on fragmented manual processes—including static PDF forms, emailed spreadsheets, and physical sign-offs between students, academic supervisors, and host employers.</w:t>
+        <w:t xml:space="preserve"> </w:t>
+      </w:r>
+      <w:r>
+        <w:rPr>
+          <w:rFonts w:asciiTheme="minorHAnsi" w:hAnsiTheme="minorHAnsi" w:cstheme="minorHAnsi"/>
+        </w:rPr>
+        <w:t>Occupational qualifications require workplace hours, workshops, and portfolios before the final external assessment. Tracking still uses PDF forms, emailed spreadsheets, and physical sign-offs.</w:t>
+      </w:r>
+    </w:p>
+    <w:p>
+      <w:pPr>
+        <w:pStyle w:val="ListParagraph"/>
+        <w:numPr>
+          <w:ilvl w:val="0"/>
+          <w:numId w:val="2"/>
+        </w:numPr>
+        <w:spacing w:line="240" w:lineRule="auto"/>
+        <w:rPr>
+          <w:rFonts w:eastAsia="Times New Roman" w:cstheme="minorHAnsi"/>
+          <w:kern w:val="0"/>
+          <w14:ligatures w14:val="none"/>
+        </w:rPr>
+      </w:pPr>
+      <w:r>
+        <w:rPr>
+          <w:rFonts w:cstheme="minorHAnsi"/>
+          <w:b/>
+          <w:bCs/>
+        </w:rPr>
+        <w:t>Core Problem:</w:t>
+      </w:r>
+      <w:r>
+        <w:rPr>
+          <w:rFonts w:cstheme="minorHAnsi"/>
+        </w:rPr>
+        <w:t xml:space="preserve"> </w:t>
+      </w:r>
+      <w:r>
+        <w:rPr>
+          <w:rFonts w:eastAsia="Times New Roman" w:cstheme="minorHAnsi"/>
+          <w:kern w:val="0"/>
+          <w14:ligatures w14:val="none"/>
+        </w:rPr>
+        <w:t>Entries are lost or unverified, at-risk students are noticed late, coordinators have no live view, and audits are slow. An LMS grades classwork and does not verify host employers. Dedicated placement systems (Chapter 2) assume a full university rollout.</w:t>
       </w:r>
     </w:p>
     <w:p>
@@ -736,7 +779,7 @@
           <w:numId w:val="2"/>
         </w:numPr>
         <w:rPr>
-          <w:rFonts w:asciiTheme="minorHAnsi" w:hAnsiTheme="minorHAnsi" w:cstheme="minorHAnsi"/>
+          <w:rFonts w:cstheme="minorHAnsi"/>
         </w:rPr>
       </w:pPr>
       <w:r>
@@ -745,13 +788,27 @@
           <w:b/>
           <w:bCs/>
         </w:rPr>
-        <w:t>Core Problem:</w:t>
+        <w:t>Proposed Software Engineering Solution:</w:t>
       </w:r>
       <w:r>
         <w:rPr>
           <w:rFonts w:asciiTheme="minorHAnsi" w:hAnsiTheme="minorHAnsi" w:cstheme="minorHAnsi"/>
         </w:rPr>
-        <w:t xml:space="preserve"> This decentralized workflow creates critical bottlenecks: lost or unverified logbook entries, delayed identification of at-risk students, lack of real-time visibility for academic coordinators, and high administrative overhead during audit cycles. Existing Learning Management Systems (LMS) focus on classroom grading and lack dedicated multi-party workflows for external employer verification.</w:t>
+        <w:t xml:space="preserve"> </w:t>
+      </w:r>
+      <w:proofErr w:type="spellStart"/>
+      <w:r>
+        <w:rPr>
+          <w:rFonts w:asciiTheme="minorHAnsi" w:hAnsiTheme="minorHAnsi" w:cstheme="minorHAnsi"/>
+        </w:rPr>
+        <w:t>TrackWIL</w:t>
+      </w:r>
+      <w:proofErr w:type="spellEnd"/>
+      <w:r>
+        <w:rPr>
+          <w:rFonts w:asciiTheme="minorHAnsi" w:hAnsiTheme="minorHAnsi" w:cstheme="minorHAnsi"/>
+        </w:rPr>
+        <w:t>, a role-based web app. Core product: logbook entry, secure token verification, and a coordinator dashboard. Analytics, bulk exports, and audit logs are stretch goals, and only if the core is finished before 29 October 2026.</w:t>
       </w:r>
     </w:p>
     <w:p>
@@ -762,7 +819,7 @@
           <w:numId w:val="2"/>
         </w:numPr>
         <w:rPr>
-          <w:rFonts w:asciiTheme="minorHAnsi" w:hAnsiTheme="minorHAnsi" w:cstheme="minorHAnsi"/>
+          <w:rFonts w:cstheme="minorHAnsi"/>
         </w:rPr>
       </w:pPr>
       <w:r>
@@ -771,13 +828,7 @@
           <w:b/>
           <w:bCs/>
         </w:rPr>
-        <w:t>Proposed Software Engineering Solution:</w:t>
-      </w:r>
-      <w:r>
-        <w:rPr>
-          <w:rFonts w:asciiTheme="minorHAnsi" w:hAnsiTheme="minorHAnsi" w:cstheme="minorHAnsi"/>
-        </w:rPr>
-        <w:t xml:space="preserve"> The group proposes architecting and evaluating </w:t>
+        <w:t>Research</w:t>
       </w:r>
       <w:r>
         <w:rPr>
@@ -785,80 +836,27 @@
           <w:b/>
           <w:bCs/>
         </w:rPr>
-        <w:t>TrackWIL</w:t>
+        <w:t xml:space="preserve"> &amp; Data Feasibility:</w:t>
       </w:r>
       <w:r>
         <w:rPr>
           <w:rFonts w:asciiTheme="minorHAnsi" w:hAnsiTheme="minorHAnsi" w:cstheme="minorHAnsi"/>
         </w:rPr>
-        <w:t>, a centralized, role-based web application that digitizes workplace logbook submissions, automates supervisor verification via secure token links (requiring no complex onboarding for external employers), and provides campus coordinators with a real-time compliance analytics dashboard.</w:t>
+        <w:t xml:space="preserve"> </w:t>
+      </w:r>
+      <w:r>
+        <w:rPr>
+          <w:rFonts w:asciiTheme="minorHAnsi" w:hAnsiTheme="minorHAnsi" w:cstheme="minorHAnsi"/>
+        </w:rPr>
+        <w:t>Questionnaires, time-on-task comparisons, and usability tests with staff and students. No personal information is collected until written campus permission, and it is protected under POPIA.</w:t>
       </w:r>
     </w:p>
     <w:p>
       <w:pPr>
-        <w:pStyle w:val="NormalWeb"/>
-        <w:numPr>
-          <w:ilvl w:val="0"/>
-          <w:numId w:val="2"/>
-        </w:numPr>
-        <w:rPr>
-          <w:rFonts w:asciiTheme="minorHAnsi" w:hAnsiTheme="minorHAnsi" w:cstheme="minorHAnsi"/>
-        </w:rPr>
-      </w:pPr>
-      <w:r>
-        <w:rPr>
-          <w:rFonts w:asciiTheme="minorHAnsi" w:hAnsiTheme="minorHAnsi" w:cstheme="minorHAnsi"/>
-          <w:b/>
-          <w:bCs/>
-        </w:rPr>
-        <w:t>Research</w:t>
-      </w:r>
-      <w:r>
-        <w:rPr>
-          <w:rFonts w:asciiTheme="minorHAnsi" w:hAnsiTheme="minorHAnsi" w:cstheme="minorHAnsi"/>
-          <w:b/>
-          <w:bCs/>
-        </w:rPr>
-        <w:t xml:space="preserve"> &amp; Data Feasibility:</w:t>
-      </w:r>
-      <w:r>
-        <w:rPr>
-          <w:rFonts w:asciiTheme="minorHAnsi" w:hAnsiTheme="minorHAnsi" w:cstheme="minorHAnsi"/>
-        </w:rPr>
-        <w:t xml:space="preserve"> Empirical data and system requirements will be gathered directly from campus academic staff, placement coordinators, and enrolled students via structured questionnaires, time-on-task comparisons (manual vs. digital submission), and usability testing.</w:t>
-      </w:r>
-    </w:p>
-    <w:p>
-      <w:pPr>
-        <w:pStyle w:val="NormalWeb"/>
-        <w:rPr>
-          <w:rFonts w:asciiTheme="minorHAnsi" w:hAnsiTheme="minorHAnsi" w:cstheme="minorHAnsi"/>
-        </w:rPr>
-      </w:pPr>
-    </w:p>
-    <w:p>
-      <w:pPr>
-        <w:pStyle w:val="NormalWeb"/>
-        <w:rPr>
-          <w:rFonts w:asciiTheme="minorHAnsi" w:hAnsiTheme="minorHAnsi" w:cstheme="minorHAnsi"/>
-        </w:rPr>
-      </w:pPr>
-    </w:p>
-    <w:p>
-      <w:pPr>
-        <w:pStyle w:val="NormalWeb"/>
-        <w:rPr>
-          <w:rFonts w:asciiTheme="minorHAnsi" w:hAnsiTheme="minorHAnsi" w:cstheme="minorHAnsi"/>
-        </w:rPr>
-      </w:pPr>
-    </w:p>
-    <w:p>
-      <w:pPr>
         <w:pStyle w:val="Heading1"/>
       </w:pPr>
       <w:r>
-        <w:lastRenderedPageBreak/>
-        <w:t>Target Stakeholders</w:t>
+        <w:t>Stakeholders, Core Product, And Stretch Goals</w:t>
       </w:r>
     </w:p>
     <w:p>
@@ -878,13 +876,13 @@
           <w:b/>
           <w:bCs/>
         </w:rPr>
-        <w:t>Primary Users (Students):</w:t>
+        <w:t xml:space="preserve">Students: </w:t>
       </w:r>
       <w:r>
         <w:rPr>
           <w:rFonts w:asciiTheme="minorHAnsi" w:hAnsiTheme="minorHAnsi" w:cstheme="minorHAnsi"/>
         </w:rPr>
-        <w:t xml:space="preserve"> Require a mobile-responsive interface to log daily/weekly practical tasks, upload evidence documents, and track their completion percentage against qualification requirements.</w:t>
+        <w:t>Log tasks, upload evidence, and see hours completed.</w:t>
       </w:r>
     </w:p>
     <w:p>
@@ -904,13 +902,13 @@
           <w:b/>
           <w:bCs/>
         </w:rPr>
-        <w:t>External Evaluators (Host Employers / Mentors):</w:t>
+        <w:t>Host Employers:</w:t>
       </w:r>
       <w:r>
         <w:rPr>
           <w:rFonts w:asciiTheme="minorHAnsi" w:hAnsiTheme="minorHAnsi" w:cstheme="minorHAnsi"/>
         </w:rPr>
-        <w:t xml:space="preserve"> Require a frictionless, secure verification workflow to review and digitally sign off on student hours without needing to manage permanent institutional accounts.</w:t>
+        <w:t xml:space="preserve"> Sign off from a secure link, with no account. </w:t>
       </w:r>
     </w:p>
     <w:p>
@@ -930,36 +928,964 @@
           <w:b/>
           <w:bCs/>
         </w:rPr>
-        <w:t>Institutional Administrators (Academic Coordinators &amp; Assessors):</w:t>
+        <w:t>Coordinators:</w:t>
       </w:r>
       <w:r>
         <w:rPr>
           <w:rFonts w:asciiTheme="minorHAnsi" w:hAnsiTheme="minorHAnsi" w:cstheme="minorHAnsi"/>
         </w:rPr>
-        <w:t xml:space="preserve"> Require automated exception reporting (flagging overdue submissions), bulk compliance exports, and tamper-evident audit logs for external quality assurance bodies.</w:t>
+        <w:t xml:space="preserve"> See on-track, awaiting verification, and overdue logbooks.</w:t>
       </w:r>
     </w:p>
     <w:p>
       <w:pPr>
-        <w:pStyle w:val="Heading1"/>
-      </w:pPr>
-      <w:r>
-        <w:t>High-Level Software Engineering Methodology</w:t>
+        <w:pStyle w:val="NormalWeb"/>
+        <w:numPr>
+          <w:ilvl w:val="0"/>
+          <w:numId w:val="3"/>
+        </w:numPr>
+        <w:rPr>
+          <w:rFonts w:asciiTheme="minorHAnsi" w:hAnsiTheme="minorHAnsi" w:cstheme="minorHAnsi"/>
+        </w:rPr>
+      </w:pPr>
+      <w:r>
+        <w:rPr>
+          <w:rFonts w:asciiTheme="minorHAnsi" w:hAnsiTheme="minorHAnsi" w:cstheme="minorHAnsi"/>
+          <w:b/>
+          <w:bCs/>
+        </w:rPr>
+        <w:t>Core:</w:t>
+      </w:r>
+      <w:r>
+        <w:rPr>
+          <w:rFonts w:asciiTheme="minorHAnsi" w:hAnsiTheme="minorHAnsi" w:cstheme="minorHAnsi"/>
+        </w:rPr>
+        <w:t xml:space="preserve"> </w:t>
       </w:r>
     </w:p>
     <w:p>
-      <w:r>
-        <w:t xml:space="preserve">To balance structured academic research documentation with iterative software architecture, Group 3 will adopt a </w:t>
-      </w:r>
-      <w:r>
-        <w:rPr>
+      <w:pPr>
+        <w:pStyle w:val="NormalWeb"/>
+        <w:numPr>
+          <w:ilvl w:val="1"/>
+          <w:numId w:val="3"/>
+        </w:numPr>
+        <w:rPr>
+          <w:rFonts w:asciiTheme="minorHAnsi" w:hAnsiTheme="minorHAnsi" w:cstheme="minorHAnsi"/>
+        </w:rPr>
+      </w:pPr>
+      <w:r>
+        <w:rPr>
+          <w:rFonts w:asciiTheme="minorHAnsi" w:hAnsiTheme="minorHAnsi" w:cstheme="minorHAnsi"/>
+        </w:rPr>
+        <w:t xml:space="preserve">Logbook entry with evidence and hour progress. </w:t>
+      </w:r>
+    </w:p>
+    <w:p>
+      <w:pPr>
+        <w:pStyle w:val="NormalWeb"/>
+        <w:numPr>
+          <w:ilvl w:val="1"/>
+          <w:numId w:val="3"/>
+        </w:numPr>
+        <w:rPr>
+          <w:rFonts w:asciiTheme="minorHAnsi" w:hAnsiTheme="minorHAnsi" w:cstheme="minorHAnsi"/>
+        </w:rPr>
+      </w:pPr>
+      <w:r>
+        <w:rPr>
+          <w:rFonts w:asciiTheme="minorHAnsi" w:hAnsiTheme="minorHAnsi" w:cstheme="minorHAnsi"/>
+        </w:rPr>
+        <w:t>A Time-limited token so the employer verifies without an account</w:t>
+      </w:r>
+    </w:p>
+    <w:p>
+      <w:pPr>
+        <w:pStyle w:val="NormalWeb"/>
+        <w:numPr>
+          <w:ilvl w:val="1"/>
+          <w:numId w:val="3"/>
+        </w:numPr>
+        <w:rPr>
+          <w:rFonts w:asciiTheme="minorHAnsi" w:hAnsiTheme="minorHAnsi" w:cstheme="minorHAnsi"/>
+        </w:rPr>
+      </w:pPr>
+      <w:r>
+        <w:rPr>
+          <w:rFonts w:asciiTheme="minorHAnsi" w:hAnsiTheme="minorHAnsi" w:cstheme="minorHAnsi"/>
+        </w:rPr>
+        <w:t>The coordinator dashboard.</w:t>
+      </w:r>
+    </w:p>
+    <w:p>
+      <w:pPr>
+        <w:pStyle w:val="NormalWeb"/>
+        <w:numPr>
+          <w:ilvl w:val="0"/>
+          <w:numId w:val="3"/>
+        </w:numPr>
+        <w:rPr>
+          <w:rFonts w:asciiTheme="minorHAnsi" w:hAnsiTheme="minorHAnsi" w:cstheme="minorHAnsi"/>
+        </w:rPr>
+      </w:pPr>
+      <w:r>
+        <w:rPr>
+          <w:rFonts w:asciiTheme="minorHAnsi" w:hAnsiTheme="minorHAnsi" w:cstheme="minorHAnsi"/>
           <w:b/>
           <w:bCs/>
         </w:rPr>
-        <w:t>Hybrid Agile-Scrum Methodology</w:t>
-      </w:r>
-      <w:r>
-        <w:t xml:space="preserve"> organized around a 4+1 Architectural View Model:</w:t>
+        <w:t xml:space="preserve">Stretch, only after the core works and only before 29 Oktober: </w:t>
+      </w:r>
+      <w:r>
+        <w:rPr>
+          <w:rFonts w:asciiTheme="minorHAnsi" w:hAnsiTheme="minorHAnsi" w:cstheme="minorHAnsi"/>
+        </w:rPr>
+        <w:t>Analytics beyond the dashboard, bulk compliance exports, and an audit log.</w:t>
+      </w:r>
+    </w:p>
+    <w:p>
+      <w:pPr>
+        <w:pStyle w:val="Heading1"/>
+      </w:pPr>
+      <w:r>
+        <w:lastRenderedPageBreak/>
+        <w:t>Chapter 2: Existing WIL and Placement Tools</w:t>
+      </w:r>
+    </w:p>
+    <w:p>
+      <w:r>
+        <w:t xml:space="preserve">Record hours, have the host verify them, and show the coordinator who is behind. Existing tools already do this. </w:t>
+      </w:r>
+      <w:proofErr w:type="spellStart"/>
+      <w:r>
+        <w:t>TrackWIL</w:t>
+      </w:r>
+      <w:proofErr w:type="spellEnd"/>
+      <w:r>
+        <w:t xml:space="preserve"> keeps those three jobs and removes the account and </w:t>
+      </w:r>
+      <w:r>
+        <w:t>license</w:t>
+      </w:r>
+      <w:r>
+        <w:t xml:space="preserve"> burden on the host employer.</w:t>
+      </w:r>
+    </w:p>
+    <w:tbl>
+      <w:tblPr>
+        <w:tblStyle w:val="TableGrid"/>
+        <w:tblW w:w="0" w:type="auto"/>
+        <w:tblLook w:val="04A0" w:firstRow="1" w:lastRow="0" w:firstColumn="1" w:lastColumn="0" w:noHBand="0" w:noVBand="1"/>
+      </w:tblPr>
+      <w:tblGrid>
+        <w:gridCol w:w="1870"/>
+        <w:gridCol w:w="1870"/>
+        <w:gridCol w:w="1870"/>
+        <w:gridCol w:w="1870"/>
+        <w:gridCol w:w="1870"/>
+      </w:tblGrid>
+      <w:tr>
+        <w:tc>
+          <w:tcPr>
+            <w:tcW w:w="1870" w:type="dxa"/>
+          </w:tcPr>
+          <w:p>
+            <w:pPr>
+              <w:rPr>
+                <w:b/>
+                <w:bCs/>
+                <w:sz w:val="28"/>
+                <w:szCs w:val="28"/>
+              </w:rPr>
+            </w:pPr>
+            <w:r>
+              <w:rPr>
+                <w:b/>
+                <w:bCs/>
+                <w:sz w:val="28"/>
+                <w:szCs w:val="28"/>
+              </w:rPr>
+              <w:t>Tool</w:t>
+            </w:r>
+          </w:p>
+        </w:tc>
+        <w:tc>
+          <w:tcPr>
+            <w:tcW w:w="1870" w:type="dxa"/>
+          </w:tcPr>
+          <w:p>
+            <w:pPr>
+              <w:rPr>
+                <w:b/>
+                <w:bCs/>
+                <w:sz w:val="28"/>
+                <w:szCs w:val="28"/>
+              </w:rPr>
+            </w:pPr>
+            <w:r>
+              <w:rPr>
+                <w:b/>
+                <w:bCs/>
+                <w:sz w:val="28"/>
+                <w:szCs w:val="28"/>
+              </w:rPr>
+              <w:t>Logbook</w:t>
+            </w:r>
+          </w:p>
+        </w:tc>
+        <w:tc>
+          <w:tcPr>
+            <w:tcW w:w="1870" w:type="dxa"/>
+          </w:tcPr>
+          <w:p>
+            <w:pPr>
+              <w:rPr>
+                <w:b/>
+                <w:bCs/>
+                <w:sz w:val="28"/>
+                <w:szCs w:val="28"/>
+              </w:rPr>
+            </w:pPr>
+            <w:r>
+              <w:rPr>
+                <w:b/>
+                <w:bCs/>
+                <w:sz w:val="28"/>
+                <w:szCs w:val="28"/>
+              </w:rPr>
+              <w:t xml:space="preserve">Employer check </w:t>
+            </w:r>
+          </w:p>
+        </w:tc>
+        <w:tc>
+          <w:tcPr>
+            <w:tcW w:w="1870" w:type="dxa"/>
+          </w:tcPr>
+          <w:p>
+            <w:pPr>
+              <w:rPr>
+                <w:b/>
+                <w:bCs/>
+                <w:sz w:val="28"/>
+                <w:szCs w:val="28"/>
+              </w:rPr>
+            </w:pPr>
+            <w:r>
+              <w:rPr>
+                <w:b/>
+                <w:bCs/>
+                <w:sz w:val="28"/>
+                <w:szCs w:val="28"/>
+              </w:rPr>
+              <w:t>Coordinator view</w:t>
+            </w:r>
+          </w:p>
+        </w:tc>
+        <w:tc>
+          <w:tcPr>
+            <w:tcW w:w="1870" w:type="dxa"/>
+          </w:tcPr>
+          <w:p>
+            <w:pPr>
+              <w:rPr>
+                <w:b/>
+                <w:bCs/>
+                <w:sz w:val="28"/>
+                <w:szCs w:val="28"/>
+              </w:rPr>
+            </w:pPr>
+            <w:r>
+              <w:rPr>
+                <w:b/>
+                <w:bCs/>
+                <w:sz w:val="28"/>
+                <w:szCs w:val="28"/>
+              </w:rPr>
+              <w:t>Limit for this Project</w:t>
+            </w:r>
+          </w:p>
+        </w:tc>
+      </w:tr>
+      <w:tr>
+        <w:tc>
+          <w:tcPr>
+            <w:tcW w:w="1870" w:type="dxa"/>
+          </w:tcPr>
+          <w:p>
+            <w:pPr>
+              <w:rPr>
+                <w:sz w:val="20"/>
+                <w:szCs w:val="20"/>
+              </w:rPr>
+            </w:pPr>
+            <w:r>
+              <w:rPr>
+                <w:sz w:val="20"/>
+                <w:szCs w:val="20"/>
+              </w:rPr>
+              <w:t>PDF, email, paper</w:t>
+            </w:r>
+          </w:p>
+        </w:tc>
+        <w:tc>
+          <w:tcPr>
+            <w:tcW w:w="1870" w:type="dxa"/>
+          </w:tcPr>
+          <w:p>
+            <w:pPr>
+              <w:rPr>
+                <w:sz w:val="20"/>
+                <w:szCs w:val="20"/>
+              </w:rPr>
+            </w:pPr>
+            <w:r>
+              <w:rPr>
+                <w:sz w:val="20"/>
+                <w:szCs w:val="20"/>
+              </w:rPr>
+              <w:t>Form or sheet</w:t>
+            </w:r>
+          </w:p>
+        </w:tc>
+        <w:tc>
+          <w:tcPr>
+            <w:tcW w:w="1870" w:type="dxa"/>
+          </w:tcPr>
+          <w:p>
+            <w:pPr>
+              <w:rPr>
+                <w:sz w:val="20"/>
+                <w:szCs w:val="20"/>
+              </w:rPr>
+            </w:pPr>
+            <w:r>
+              <w:rPr>
+                <w:sz w:val="20"/>
+                <w:szCs w:val="20"/>
+              </w:rPr>
+              <w:t>Physical or Email sign-off</w:t>
+            </w:r>
+          </w:p>
+        </w:tc>
+        <w:tc>
+          <w:tcPr>
+            <w:tcW w:w="1870" w:type="dxa"/>
+          </w:tcPr>
+          <w:p>
+            <w:pPr>
+              <w:rPr>
+                <w:sz w:val="20"/>
+                <w:szCs w:val="20"/>
+              </w:rPr>
+            </w:pPr>
+            <w:r>
+              <w:rPr>
+                <w:sz w:val="20"/>
+                <w:szCs w:val="20"/>
+              </w:rPr>
+              <w:t>Manual collation</w:t>
+            </w:r>
+          </w:p>
+        </w:tc>
+        <w:tc>
+          <w:tcPr>
+            <w:tcW w:w="1870" w:type="dxa"/>
+          </w:tcPr>
+          <w:p>
+            <w:pPr>
+              <w:rPr>
+                <w:sz w:val="20"/>
+                <w:szCs w:val="20"/>
+              </w:rPr>
+            </w:pPr>
+            <w:r>
+              <w:rPr>
+                <w:sz w:val="20"/>
+                <w:szCs w:val="20"/>
+              </w:rPr>
+              <w:t>Current process;</w:t>
+            </w:r>
+          </w:p>
+          <w:p>
+            <w:pPr>
+              <w:rPr>
+                <w:sz w:val="20"/>
+                <w:szCs w:val="20"/>
+              </w:rPr>
+            </w:pPr>
+            <w:r>
+              <w:rPr>
+                <w:sz w:val="20"/>
+                <w:szCs w:val="20"/>
+              </w:rPr>
+              <w:t>Entries get lost</w:t>
+            </w:r>
+          </w:p>
+        </w:tc>
+      </w:tr>
+      <w:tr>
+        <w:tc>
+          <w:tcPr>
+            <w:tcW w:w="1870" w:type="dxa"/>
+          </w:tcPr>
+          <w:p>
+            <w:pPr>
+              <w:rPr>
+                <w:sz w:val="20"/>
+                <w:szCs w:val="20"/>
+              </w:rPr>
+            </w:pPr>
+            <w:r>
+              <w:rPr>
+                <w:sz w:val="20"/>
+                <w:szCs w:val="20"/>
+              </w:rPr>
+              <w:t>Module (LMS)</w:t>
+            </w:r>
+          </w:p>
+        </w:tc>
+        <w:tc>
+          <w:tcPr>
+            <w:tcW w:w="1870" w:type="dxa"/>
+          </w:tcPr>
+          <w:p>
+            <w:pPr>
+              <w:rPr>
+                <w:sz w:val="20"/>
+                <w:szCs w:val="20"/>
+              </w:rPr>
+            </w:pPr>
+            <w:r>
+              <w:rPr>
+                <w:sz w:val="20"/>
+                <w:szCs w:val="20"/>
+              </w:rPr>
+              <w:t>Assignment upload</w:t>
+            </w:r>
+          </w:p>
+        </w:tc>
+        <w:tc>
+          <w:tcPr>
+            <w:tcW w:w="1870" w:type="dxa"/>
+          </w:tcPr>
+          <w:p>
+            <w:pPr>
+              <w:rPr>
+                <w:sz w:val="20"/>
+                <w:szCs w:val="20"/>
+              </w:rPr>
+            </w:pPr>
+            <w:r>
+              <w:rPr>
+                <w:sz w:val="20"/>
+                <w:szCs w:val="20"/>
+              </w:rPr>
+              <w:t>Needs an enrolled account</w:t>
+            </w:r>
+          </w:p>
+        </w:tc>
+        <w:tc>
+          <w:tcPr>
+            <w:tcW w:w="1870" w:type="dxa"/>
+          </w:tcPr>
+          <w:p>
+            <w:pPr>
+              <w:rPr>
+                <w:sz w:val="20"/>
+                <w:szCs w:val="20"/>
+              </w:rPr>
+            </w:pPr>
+            <w:r>
+              <w:rPr>
+                <w:sz w:val="20"/>
+                <w:szCs w:val="20"/>
+              </w:rPr>
+              <w:t>Gradebook</w:t>
+            </w:r>
+          </w:p>
+        </w:tc>
+        <w:tc>
+          <w:tcPr>
+            <w:tcW w:w="1870" w:type="dxa"/>
+          </w:tcPr>
+          <w:p>
+            <w:pPr>
+              <w:rPr>
+                <w:sz w:val="20"/>
+                <w:szCs w:val="20"/>
+              </w:rPr>
+            </w:pPr>
+            <w:r>
+              <w:rPr>
+                <w:sz w:val="20"/>
+                <w:szCs w:val="20"/>
+              </w:rPr>
+              <w:t>Built for classroom grading</w:t>
+            </w:r>
+          </w:p>
+        </w:tc>
+      </w:tr>
+      <w:tr>
+        <w:tc>
+          <w:tcPr>
+            <w:tcW w:w="1870" w:type="dxa"/>
+          </w:tcPr>
+          <w:p>
+            <w:pPr>
+              <w:rPr>
+                <w:sz w:val="20"/>
+                <w:szCs w:val="20"/>
+              </w:rPr>
+            </w:pPr>
+            <w:proofErr w:type="spellStart"/>
+            <w:r>
+              <w:rPr>
+                <w:sz w:val="20"/>
+                <w:szCs w:val="20"/>
+              </w:rPr>
+              <w:t>InPlace</w:t>
+            </w:r>
+            <w:proofErr w:type="spellEnd"/>
+          </w:p>
+        </w:tc>
+        <w:tc>
+          <w:tcPr>
+            <w:tcW w:w="1870" w:type="dxa"/>
+          </w:tcPr>
+          <w:p>
+            <w:pPr>
+              <w:rPr>
+                <w:sz w:val="20"/>
+                <w:szCs w:val="20"/>
+              </w:rPr>
+            </w:pPr>
+            <w:r>
+              <w:rPr>
+                <w:sz w:val="20"/>
+                <w:szCs w:val="20"/>
+              </w:rPr>
+              <w:t>Student Log Book</w:t>
+            </w:r>
+          </w:p>
+        </w:tc>
+        <w:tc>
+          <w:tcPr>
+            <w:tcW w:w="1870" w:type="dxa"/>
+          </w:tcPr>
+          <w:p>
+            <w:pPr>
+              <w:rPr>
+                <w:sz w:val="20"/>
+                <w:szCs w:val="20"/>
+              </w:rPr>
+            </w:pPr>
+            <w:r>
+              <w:rPr>
+                <w:sz w:val="20"/>
+                <w:szCs w:val="20"/>
+              </w:rPr>
+              <w:t>Supervisor portal account</w:t>
+            </w:r>
+          </w:p>
+        </w:tc>
+        <w:tc>
+          <w:tcPr>
+            <w:tcW w:w="1870" w:type="dxa"/>
+          </w:tcPr>
+          <w:p>
+            <w:pPr>
+              <w:rPr>
+                <w:sz w:val="20"/>
+                <w:szCs w:val="20"/>
+              </w:rPr>
+            </w:pPr>
+            <w:r>
+              <w:rPr>
+                <w:sz w:val="20"/>
+                <w:szCs w:val="20"/>
+              </w:rPr>
+              <w:t>Portal and analytics</w:t>
+            </w:r>
+          </w:p>
+        </w:tc>
+        <w:tc>
+          <w:tcPr>
+            <w:tcW w:w="1870" w:type="dxa"/>
+          </w:tcPr>
+          <w:p>
+            <w:pPr>
+              <w:rPr>
+                <w:sz w:val="20"/>
+                <w:szCs w:val="20"/>
+              </w:rPr>
+            </w:pPr>
+            <w:r>
+              <w:rPr>
+                <w:sz w:val="20"/>
+                <w:szCs w:val="20"/>
+              </w:rPr>
+              <w:t>Licensed university WIL suite</w:t>
+            </w:r>
+          </w:p>
+        </w:tc>
+      </w:tr>
+      <w:tr>
+        <w:tc>
+          <w:tcPr>
+            <w:tcW w:w="1870" w:type="dxa"/>
+          </w:tcPr>
+          <w:p>
+            <w:pPr>
+              <w:rPr>
+                <w:sz w:val="20"/>
+                <w:szCs w:val="20"/>
+              </w:rPr>
+            </w:pPr>
+            <w:r>
+              <w:rPr>
+                <w:sz w:val="20"/>
+                <w:szCs w:val="20"/>
+              </w:rPr>
+              <w:t>SONIA</w:t>
+            </w:r>
+          </w:p>
+        </w:tc>
+        <w:tc>
+          <w:tcPr>
+            <w:tcW w:w="1870" w:type="dxa"/>
+          </w:tcPr>
+          <w:p>
+            <w:pPr>
+              <w:rPr>
+                <w:sz w:val="20"/>
+                <w:szCs w:val="20"/>
+              </w:rPr>
+            </w:pPr>
+            <w:r>
+              <w:rPr>
+                <w:sz w:val="20"/>
+                <w:szCs w:val="20"/>
+              </w:rPr>
+              <w:t>Timesheets</w:t>
+            </w:r>
+          </w:p>
+        </w:tc>
+        <w:tc>
+          <w:tcPr>
+            <w:tcW w:w="1870" w:type="dxa"/>
+          </w:tcPr>
+          <w:p>
+            <w:pPr>
+              <w:rPr>
+                <w:sz w:val="20"/>
+                <w:szCs w:val="20"/>
+              </w:rPr>
+            </w:pPr>
+            <w:r>
+              <w:rPr>
+                <w:sz w:val="20"/>
+                <w:szCs w:val="20"/>
+              </w:rPr>
+              <w:t>Mentor account</w:t>
+            </w:r>
+          </w:p>
+        </w:tc>
+        <w:tc>
+          <w:tcPr>
+            <w:tcW w:w="1870" w:type="dxa"/>
+          </w:tcPr>
+          <w:p>
+            <w:pPr>
+              <w:rPr>
+                <w:sz w:val="20"/>
+                <w:szCs w:val="20"/>
+              </w:rPr>
+            </w:pPr>
+            <w:r>
+              <w:rPr>
+                <w:sz w:val="20"/>
+                <w:szCs w:val="20"/>
+              </w:rPr>
+              <w:t>Placement console</w:t>
+            </w:r>
+          </w:p>
+        </w:tc>
+        <w:tc>
+          <w:tcPr>
+            <w:tcW w:w="1870" w:type="dxa"/>
+          </w:tcPr>
+          <w:p>
+            <w:pPr>
+              <w:rPr>
+                <w:sz w:val="20"/>
+                <w:szCs w:val="20"/>
+              </w:rPr>
+            </w:pPr>
+            <w:r>
+              <w:rPr>
+                <w:sz w:val="20"/>
+                <w:szCs w:val="20"/>
+              </w:rPr>
+              <w:t>Built for a placement office</w:t>
+            </w:r>
+          </w:p>
+        </w:tc>
+      </w:tr>
+      <w:tr>
+        <w:tc>
+          <w:tcPr>
+            <w:tcW w:w="1870" w:type="dxa"/>
+          </w:tcPr>
+          <w:p>
+            <w:pPr>
+              <w:rPr>
+                <w:sz w:val="20"/>
+                <w:szCs w:val="20"/>
+              </w:rPr>
+            </w:pPr>
+            <w:proofErr w:type="spellStart"/>
+            <w:r>
+              <w:rPr>
+                <w:sz w:val="20"/>
+                <w:szCs w:val="20"/>
+              </w:rPr>
+              <w:t>PebblePad</w:t>
+            </w:r>
+            <w:proofErr w:type="spellEnd"/>
+          </w:p>
+        </w:tc>
+        <w:tc>
+          <w:tcPr>
+            <w:tcW w:w="1870" w:type="dxa"/>
+          </w:tcPr>
+          <w:p>
+            <w:pPr>
+              <w:rPr>
+                <w:sz w:val="20"/>
+                <w:szCs w:val="20"/>
+              </w:rPr>
+            </w:pPr>
+            <w:r>
+              <w:rPr>
+                <w:sz w:val="20"/>
+                <w:szCs w:val="20"/>
+              </w:rPr>
+              <w:t>Workbook activity log</w:t>
+            </w:r>
+          </w:p>
+        </w:tc>
+        <w:tc>
+          <w:tcPr>
+            <w:tcW w:w="1870" w:type="dxa"/>
+          </w:tcPr>
+          <w:p>
+            <w:pPr>
+              <w:rPr>
+                <w:sz w:val="20"/>
+                <w:szCs w:val="20"/>
+              </w:rPr>
+            </w:pPr>
+            <w:r>
+              <w:rPr>
+                <w:sz w:val="20"/>
+                <w:szCs w:val="20"/>
+              </w:rPr>
+              <w:t>External assessor access</w:t>
+            </w:r>
+          </w:p>
+        </w:tc>
+        <w:tc>
+          <w:tcPr>
+            <w:tcW w:w="1870" w:type="dxa"/>
+          </w:tcPr>
+          <w:p>
+            <w:pPr>
+              <w:rPr>
+                <w:sz w:val="20"/>
+                <w:szCs w:val="20"/>
+              </w:rPr>
+            </w:pPr>
+            <w:r>
+              <w:rPr>
+                <w:sz w:val="20"/>
+                <w:szCs w:val="20"/>
+              </w:rPr>
+              <w:t>Workbook reports</w:t>
+            </w:r>
+          </w:p>
+        </w:tc>
+        <w:tc>
+          <w:tcPr>
+            <w:tcW w:w="1870" w:type="dxa"/>
+          </w:tcPr>
+          <w:p>
+            <w:pPr>
+              <w:rPr>
+                <w:sz w:val="20"/>
+                <w:szCs w:val="20"/>
+              </w:rPr>
+            </w:pPr>
+            <w:r>
+              <w:rPr>
+                <w:sz w:val="20"/>
+                <w:szCs w:val="20"/>
+              </w:rPr>
+              <w:t>Portfolio, not hour compliance</w:t>
+            </w:r>
+          </w:p>
+        </w:tc>
+      </w:tr>
+      <w:tr>
+        <w:tc>
+          <w:tcPr>
+            <w:tcW w:w="1870" w:type="dxa"/>
+          </w:tcPr>
+          <w:p>
+            <w:pPr>
+              <w:rPr>
+                <w:sz w:val="20"/>
+                <w:szCs w:val="20"/>
+              </w:rPr>
+            </w:pPr>
+            <w:proofErr w:type="spellStart"/>
+            <w:r>
+              <w:rPr>
+                <w:sz w:val="20"/>
+                <w:szCs w:val="20"/>
+              </w:rPr>
+              <w:t>TrackWIL</w:t>
+            </w:r>
+            <w:proofErr w:type="spellEnd"/>
+          </w:p>
+        </w:tc>
+        <w:tc>
+          <w:tcPr>
+            <w:tcW w:w="1870" w:type="dxa"/>
+          </w:tcPr>
+          <w:p>
+            <w:pPr>
+              <w:rPr>
+                <w:sz w:val="20"/>
+                <w:szCs w:val="20"/>
+              </w:rPr>
+            </w:pPr>
+            <w:r>
+              <w:rPr>
+                <w:sz w:val="20"/>
+                <w:szCs w:val="20"/>
+              </w:rPr>
+              <w:t>Entry and evidence</w:t>
+            </w:r>
+          </w:p>
+        </w:tc>
+        <w:tc>
+          <w:tcPr>
+            <w:tcW w:w="1870" w:type="dxa"/>
+          </w:tcPr>
+          <w:p>
+            <w:pPr>
+              <w:rPr>
+                <w:sz w:val="20"/>
+                <w:szCs w:val="20"/>
+              </w:rPr>
+            </w:pPr>
+            <w:r>
+              <w:rPr>
+                <w:sz w:val="20"/>
+                <w:szCs w:val="20"/>
+              </w:rPr>
+              <w:t>Token link, no account</w:t>
+            </w:r>
+          </w:p>
+        </w:tc>
+        <w:tc>
+          <w:tcPr>
+            <w:tcW w:w="1870" w:type="dxa"/>
+          </w:tcPr>
+          <w:p>
+            <w:pPr>
+              <w:rPr>
+                <w:sz w:val="20"/>
+                <w:szCs w:val="20"/>
+              </w:rPr>
+            </w:pPr>
+            <w:r>
+              <w:rPr>
+                <w:sz w:val="20"/>
+                <w:szCs w:val="20"/>
+              </w:rPr>
+              <w:t>Status and overdue flags</w:t>
+            </w:r>
+          </w:p>
+        </w:tc>
+        <w:tc>
+          <w:tcPr>
+            <w:tcW w:w="1870" w:type="dxa"/>
+          </w:tcPr>
+          <w:p>
+            <w:pPr>
+              <w:rPr>
+                <w:sz w:val="20"/>
+                <w:szCs w:val="20"/>
+              </w:rPr>
+            </w:pPr>
+            <w:r>
+              <w:rPr>
+                <w:sz w:val="20"/>
+                <w:szCs w:val="20"/>
+              </w:rPr>
+              <w:t>Core product for this window</w:t>
+            </w:r>
+          </w:p>
+        </w:tc>
+      </w:tr>
+    </w:tbl>
+    <w:p/>
+    <w:p>
+      <w:proofErr w:type="spellStart"/>
+      <w:r>
+        <w:t>InPlace</w:t>
+      </w:r>
+      <w:proofErr w:type="spellEnd"/>
+      <w:r>
+        <w:t xml:space="preserve">, SONIA, and </w:t>
+      </w:r>
+      <w:proofErr w:type="spellStart"/>
+      <w:r>
+        <w:t>PebblePad</w:t>
+      </w:r>
+      <w:proofErr w:type="spellEnd"/>
+      <w:r>
+        <w:t xml:space="preserve"> show that digital sign-off is established practice, and that it comes with </w:t>
+      </w:r>
+      <w:proofErr w:type="spellStart"/>
+      <w:r>
+        <w:t>licences</w:t>
+      </w:r>
+      <w:proofErr w:type="spellEnd"/>
+      <w:r>
+        <w:t xml:space="preserve">, portals, and a mentor account. This campus is still manual, so </w:t>
+      </w:r>
+      <w:proofErr w:type="spellStart"/>
+      <w:r>
+        <w:t>TrackWIL</w:t>
+      </w:r>
+      <w:proofErr w:type="spellEnd"/>
+      <w:r>
+        <w:t xml:space="preserve"> delivers the three core jobs by 29 October 2026. Analytics, bulk export, and audit history stay on the stretch list.</w:t>
+      </w:r>
+    </w:p>
+    <w:p>
+      <w:pPr>
+        <w:pStyle w:val="Heading1"/>
+      </w:pPr>
+      <w:r>
+        <w:t>Methodology</w:t>
+      </w:r>
+    </w:p>
+    <w:p>
+      <w:r>
+        <w:t>Hybrid Agile-Scrum and a 4+1 view. The week 1–7 plan ran past the window and is replaced below. Build is 3-tier: relational database, REST API with role-based access, responsive web frontend. GitHub holds the code and board. Nothing is scheduled after 29 October 2026.</w:t>
       </w:r>
     </w:p>
     <w:p>
@@ -967,18 +1893,32 @@
         <w:pStyle w:val="ListParagraph"/>
         <w:numPr>
           <w:ilvl w:val="0"/>
-          <w:numId w:val="4"/>
+          <w:numId w:val="6"/>
         </w:numPr>
-      </w:pPr>
-      <w:r>
         <w:rPr>
           <w:b/>
           <w:bCs/>
         </w:rPr>
-        <w:t>Requirements Engineering &amp; Domain Modeling (Weeks 1–2):</w:t>
-      </w:r>
-      <w:r>
-        <w:t xml:space="preserve"> Conduct stakeholder interviews and survey data collection to establish functional and non-functional requirements, documented via UML Use Case and Activity diagrams.</w:t>
+      </w:pPr>
+      <w:r>
+        <w:rPr>
+          <w:b/>
+          <w:bCs/>
+        </w:rPr>
+        <w:t>2-8 October – Requirements.</w:t>
+      </w:r>
+      <w:r>
+        <w:rPr>
+          <w:b/>
+          <w:bCs/>
+        </w:rPr>
+        <w:t xml:space="preserve"> </w:t>
+      </w:r>
+      <w:r>
+        <w:t>Confirm core and stretch. UML</w:t>
+      </w:r>
+      <w:r>
+        <w:t xml:space="preserve"> use cases and activity diagram.</w:t>
       </w:r>
     </w:p>
     <w:p>
@@ -986,18 +1926,22 @@
         <w:pStyle w:val="ListParagraph"/>
         <w:numPr>
           <w:ilvl w:val="0"/>
-          <w:numId w:val="4"/>
+          <w:numId w:val="6"/>
         </w:numPr>
-      </w:pPr>
-      <w:r>
         <w:rPr>
           <w:b/>
           <w:bCs/>
         </w:rPr>
-        <w:t>Iterative System Architecture &amp; Prototyping (Weeks 3–5):</w:t>
-      </w:r>
-      <w:r>
-        <w:t xml:space="preserve"> Execute two-week Scrum sprints utilizing GitHub for version control and project board tracking. The system will be designed using a 3-tier architecture (Relational Database with strict referential integrity, RESTful API backend with Role-Based Access Control, and a responsive web frontend).</w:t>
+      </w:pPr>
+      <w:r>
+        <w:rPr>
+          <w:b/>
+          <w:bCs/>
+        </w:rPr>
+        <w:t xml:space="preserve">9-15 Oktober – Sprint 1. </w:t>
+      </w:r>
+      <w:r>
+        <w:t xml:space="preserve"> Logbook entry: create, view, evidence, hours completed.</w:t>
       </w:r>
     </w:p>
     <w:p>
@@ -1005,31 +1949,70 @@
         <w:pStyle w:val="ListParagraph"/>
         <w:numPr>
           <w:ilvl w:val="0"/>
-          <w:numId w:val="4"/>
+          <w:numId w:val="6"/>
         </w:numPr>
-      </w:pPr>
-      <w:r>
         <w:rPr>
           <w:b/>
           <w:bCs/>
         </w:rPr>
-        <w:t>Empirical Evaluation &amp; Verification (Weeks 6–7):</w:t>
-      </w:r>
-      <w:r>
-        <w:t xml:space="preserve"> Perform unit and integration testing alongside System Usability Scale (SUS) testing with target stakeholders to empirically evaluate efficiency gains against existing manual workflows for the final dissertation and presentation.</w:t>
+      </w:pPr>
+      <w:r>
+        <w:rPr>
+          <w:b/>
+          <w:bCs/>
+        </w:rPr>
+        <w:t xml:space="preserve">16-22 Oktober – Sprint 2. </w:t>
+      </w:r>
+      <w:r>
+        <w:t xml:space="preserve"> Expiring token, employer sign-off, coordinator dashboard. Stretch work only if the core is already demonstra</w:t>
+      </w:r>
+      <w:r>
+        <w:t xml:space="preserve">ble. </w:t>
       </w:r>
     </w:p>
     <w:p>
       <w:pPr>
         <w:pStyle w:val="ListParagraph"/>
-      </w:pPr>
+        <w:numPr>
+          <w:ilvl w:val="0"/>
+          <w:numId w:val="6"/>
+        </w:numPr>
+        <w:rPr>
+          <w:b/>
+          <w:bCs/>
+        </w:rPr>
+      </w:pPr>
+      <w:r>
+        <w:rPr>
+          <w:b/>
+          <w:bCs/>
+        </w:rPr>
+        <w:t xml:space="preserve">23 – 29 Oktober – Test and Submit. </w:t>
+      </w:r>
+      <w:r>
+        <w:t xml:space="preserve"> Tests of the three core features. SUS and time-on-task only with consent after permission; otherwise, synthetic data, stated in the report. Dissertation, including this chapter, and presentation.</w:t>
+      </w:r>
     </w:p>
     <w:p>
       <w:pPr>
-        <w:pStyle w:val="ListParagraph"/>
-      </w:pPr>
+        <w:pStyle w:val="Heading1"/>
+      </w:pPr>
+      <w:r>
+        <w:lastRenderedPageBreak/>
+        <w:t>Personal Information (POPIA)</w:t>
+      </w:r>
     </w:p>
-    <w:p/>
+    <w:p>
+      <w:r>
+        <w:t xml:space="preserve">Written campus permission comes before any staff or student data is collected. Topic approval is not that permission. Participation is voluntary; people are told the purpose and that only the group and the supervising lecturer see the data. Only what the core evaluation needs is kept, in access-controlled storage. Demonstrations use synthetic data and tokens expire. Personal information is deleted after the result is </w:t>
+      </w:r>
+      <w:r>
+        <w:t>finalized</w:t>
+      </w:r>
+      <w:r>
+        <w:t>, unless the campus sets another period. If permission is late or refused, the build uses synthetic data and the dissertation says so.</w:t>
+      </w:r>
+    </w:p>
     <w:p/>
     <w:p/>
     <w:p/>
@@ -1048,6 +2031,70 @@
 <file path=word/numbering.xml><?xml version="1.0" encoding="utf-8"?>
 <w:numbering xmlns:wpc="http://schemas.microsoft.com/office/word/2010/wordprocessingCanvas" xmlns:cx="http://schemas.microsoft.com/office/drawing/2014/chartex" xmlns:cx1="http://schemas.microsoft.com/office/drawing/2015/9/8/chartex" xmlns:cx2="http://schemas.microsoft.com/office/drawing/2015/10/21/chartex" xmlns:cx3="http://schemas.microsoft.com/office/drawing/2016/5/9/chartex" xmlns:cx4="http://schemas.microsoft.com/office/drawing/2016/5/10/chartex" xmlns:cx5="http://schemas.microsoft.com/office/drawing/2016/5/11/chartex" xmlns:cx6="http://schemas.microsoft.com/office/drawing/2016/5/12/chartex" xmlns:cx7="http://schemas.microsoft.com/office/drawing/2016/5/13/chartex" xmlns:cx8="http://schemas.microsoft.com/office/drawing/2016/5/14/chartex" xmlns:mc="http://schemas.openxmlformats.org/markup-compatibility/2006" xmlns:aink="http://schemas.microsoft.com/office/drawing/2016/ink" xmlns:am3d="http://schemas.microsoft.com/office/drawing/2017/model3d" xmlns:o="urn:schemas-microsoft-com:office:office" xmlns:oel="http://schemas.microsoft.com/office/2019/extlst" xmlns:r="http://schemas.openxmlformats.org/officeDocument/2006/relationships" xmlns:m="http://schemas.openxmlformats.org/officeDocument/2006/math" xmlns:v="urn:schemas-microsoft-com:vml" xmlns:wp14="http://schemas.microsoft.com/office/word/2010/wordprocessingDrawing" xmlns:wp="http://schemas.openxmlformats.org/drawingml/2006/wordprocessingDrawing" xmlns:w10="urn:schemas-microsoft-com:office:word" xmlns:w="http://schemas.openxmlformats.org/wordprocessingml/2006/main" xmlns:w14="http://schemas.microsoft.com/office/word/2010/wordml" xmlns:w15="http://schemas.microsoft.com/office/word/2012/wordml" xmlns:w16cex="http://schemas.microsoft.com/office/word/2018/wordml/cex" xmlns:w16cid="http://schemas.microsoft.com/office/word/2016/wordml/cid" xmlns:w16="http://schemas.microsoft.com/office/word/2018/wordml" xmlns:w16du="http://schemas.microsoft.com/office/word/2023/wordml/word16du" xmlns:w16sdtdh="http://schemas.microsoft.com/office/word/2020/wordml/sdtdatahash" xmlns:w16sdtfl="http://schemas.microsoft.com/office/word/2024/wordml/sdtformatlock" xmlns:w16se="http://schemas.microsoft.com/office/word/2015/wordml/symex" xmlns:wpg="http://schemas.microsoft.com/office/word/2010/wordprocessingGroup" xmlns:wpi="http://schemas.microsoft.com/office/word/2010/wordprocessingInk" xmlns:wne="http://schemas.microsoft.com/office/word/2006/wordml" xmlns:wps="http://schemas.microsoft.com/office/word/2010/wordprocessingShape" mc:Ignorable="w14 w15 w16se w16cid w16 w16cex w16sdtdh w16sdtfl w16du wp14">
   <w:abstractNum w:abstractNumId="0" w15:restartNumberingAfterBreak="0">
+    <w:nsid w:val="00000001"/>
+    <w:multiLevelType w:val="hybridMultilevel"/>
+    <w:tmpl w:val="FFFFFFFF"/>
+    <w:lvl w:ilvl="0" w:tplc="FFFFFFFF">
+      <w:start w:val="1"/>
+      <w:numFmt w:val="decimal"/>
+      <w:lvlText w:val="%1."/>
+      <w:lvlJc w:val="left"/>
+      <w:pPr>
+        <w:tabs>
+          <w:tab w:val="num" w:pos="0"/>
+        </w:tabs>
+      </w:pPr>
+    </w:lvl>
+    <w:lvl w:ilvl="1" w:tplc="FFFFFFFF">
+      <w:numFmt w:val="bullet"/>
+      <w:lvlText w:val="·"/>
+      <w:lvlJc w:val="left"/>
+      <w:pPr>
+        <w:tabs>
+          <w:tab w:val="num" w:pos="0"/>
+        </w:tabs>
+      </w:pPr>
+      <w:rPr>
+        <w:rFonts w:ascii="Symbol" w:hAnsi="Symbol" w:cs="Symbol"/>
+      </w:rPr>
+    </w:lvl>
+    <w:lvl w:ilvl="2" w:tplc="FFFFFFFF">
+      <w:numFmt w:val="decimal"/>
+      <w:lvlText w:val=""/>
+      <w:lvlJc w:val="left"/>
+    </w:lvl>
+    <w:lvl w:ilvl="3" w:tplc="FFFFFFFF">
+      <w:numFmt w:val="decimal"/>
+      <w:lvlText w:val=""/>
+      <w:lvlJc w:val="left"/>
+    </w:lvl>
+    <w:lvl w:ilvl="4" w:tplc="FFFFFFFF">
+      <w:numFmt w:val="decimal"/>
+      <w:lvlText w:val=""/>
+      <w:lvlJc w:val="left"/>
+    </w:lvl>
+    <w:lvl w:ilvl="5" w:tplc="FFFFFFFF">
+      <w:numFmt w:val="decimal"/>
+      <w:lvlText w:val=""/>
+      <w:lvlJc w:val="left"/>
+    </w:lvl>
+    <w:lvl w:ilvl="6" w:tplc="FFFFFFFF">
+      <w:numFmt w:val="decimal"/>
+      <w:lvlText w:val=""/>
+      <w:lvlJc w:val="left"/>
+    </w:lvl>
+    <w:lvl w:ilvl="7" w:tplc="FFFFFFFF">
+      <w:numFmt w:val="decimal"/>
+      <w:lvlText w:val=""/>
+      <w:lvlJc w:val="left"/>
+    </w:lvl>
+    <w:lvl w:ilvl="8" w:tplc="FFFFFFFF">
+      <w:numFmt w:val="decimal"/>
+      <w:lvlText w:val=""/>
+      <w:lvlJc w:val="left"/>
+    </w:lvl>
+  </w:abstractNum>
+  <w:abstractNum w:abstractNumId="1" w15:restartNumberingAfterBreak="0">
     <w:nsid w:val="0CE31EF9"/>
     <w:multiLevelType w:val="hybridMultilevel"/>
     <w:tmpl w:val="F6D85B7C"/>
@@ -1063,7 +2110,7 @@
         <w:rFonts w:ascii="Symbol" w:hAnsi="Symbol" w:hint="default"/>
       </w:rPr>
     </w:lvl>
-    <w:lvl w:ilvl="1" w:tplc="04090003" w:tentative="1">
+    <w:lvl w:ilvl="1" w:tplc="04090003">
       <w:start w:val="1"/>
       <w:numFmt w:val="bullet"/>
       <w:lvlText w:val="o"/>
@@ -1160,7 +2207,120 @@
       </w:rPr>
     </w:lvl>
   </w:abstractNum>
-  <w:abstractNum w:abstractNumId="1" w15:restartNumberingAfterBreak="0">
+  <w:abstractNum w:abstractNumId="2" w15:restartNumberingAfterBreak="0">
+    <w:nsid w:val="17AF4C03"/>
+    <w:multiLevelType w:val="hybridMultilevel"/>
+    <w:tmpl w:val="C94022CC"/>
+    <w:lvl w:ilvl="0" w:tplc="04090001">
+      <w:start w:val="1"/>
+      <w:numFmt w:val="bullet"/>
+      <w:lvlText w:val=""/>
+      <w:lvlJc w:val="left"/>
+      <w:pPr>
+        <w:ind w:left="720" w:hanging="360"/>
+      </w:pPr>
+      <w:rPr>
+        <w:rFonts w:ascii="Symbol" w:hAnsi="Symbol" w:hint="default"/>
+      </w:rPr>
+    </w:lvl>
+    <w:lvl w:ilvl="1" w:tplc="04090003">
+      <w:start w:val="1"/>
+      <w:numFmt w:val="bullet"/>
+      <w:lvlText w:val="o"/>
+      <w:lvlJc w:val="left"/>
+      <w:pPr>
+        <w:ind w:left="1440" w:hanging="360"/>
+      </w:pPr>
+      <w:rPr>
+        <w:rFonts w:ascii="Courier New" w:hAnsi="Courier New" w:cs="Courier New" w:hint="default"/>
+      </w:rPr>
+    </w:lvl>
+    <w:lvl w:ilvl="2" w:tplc="04090005" w:tentative="1">
+      <w:start w:val="1"/>
+      <w:numFmt w:val="bullet"/>
+      <w:lvlText w:val=""/>
+      <w:lvlJc w:val="left"/>
+      <w:pPr>
+        <w:ind w:left="2160" w:hanging="360"/>
+      </w:pPr>
+      <w:rPr>
+        <w:rFonts w:ascii="Wingdings" w:hAnsi="Wingdings" w:hint="default"/>
+      </w:rPr>
+    </w:lvl>
+    <w:lvl w:ilvl="3" w:tplc="04090001" w:tentative="1">
+      <w:start w:val="1"/>
+      <w:numFmt w:val="bullet"/>
+      <w:lvlText w:val=""/>
+      <w:lvlJc w:val="left"/>
+      <w:pPr>
+        <w:ind w:left="2880" w:hanging="360"/>
+      </w:pPr>
+      <w:rPr>
+        <w:rFonts w:ascii="Symbol" w:hAnsi="Symbol" w:hint="default"/>
+      </w:rPr>
+    </w:lvl>
+    <w:lvl w:ilvl="4" w:tplc="04090003" w:tentative="1">
+      <w:start w:val="1"/>
+      <w:numFmt w:val="bullet"/>
+      <w:lvlText w:val="o"/>
+      <w:lvlJc w:val="left"/>
+      <w:pPr>
+        <w:ind w:left="3600" w:hanging="360"/>
+      </w:pPr>
+      <w:rPr>
+        <w:rFonts w:ascii="Courier New" w:hAnsi="Courier New" w:cs="Courier New" w:hint="default"/>
+      </w:rPr>
+    </w:lvl>
+    <w:lvl w:ilvl="5" w:tplc="04090005" w:tentative="1">
+      <w:start w:val="1"/>
+      <w:numFmt w:val="bullet"/>
+      <w:lvlText w:val=""/>
+      <w:lvlJc w:val="left"/>
+      <w:pPr>
+        <w:ind w:left="4320" w:hanging="360"/>
+      </w:pPr>
+      <w:rPr>
+        <w:rFonts w:ascii="Wingdings" w:hAnsi="Wingdings" w:hint="default"/>
+      </w:rPr>
+    </w:lvl>
+    <w:lvl w:ilvl="6" w:tplc="04090001" w:tentative="1">
+      <w:start w:val="1"/>
+      <w:numFmt w:val="bullet"/>
+      <w:lvlText w:val=""/>
+      <w:lvlJc w:val="left"/>
+      <w:pPr>
+        <w:ind w:left="5040" w:hanging="360"/>
+      </w:pPr>
+      <w:rPr>
+        <w:rFonts w:ascii="Symbol" w:hAnsi="Symbol" w:hint="default"/>
+      </w:rPr>
+    </w:lvl>
+    <w:lvl w:ilvl="7" w:tplc="04090003" w:tentative="1">
+      <w:start w:val="1"/>
+      <w:numFmt w:val="bullet"/>
+      <w:lvlText w:val="o"/>
+      <w:lvlJc w:val="left"/>
+      <w:pPr>
+        <w:ind w:left="5760" w:hanging="360"/>
+      </w:pPr>
+      <w:rPr>
+        <w:rFonts w:ascii="Courier New" w:hAnsi="Courier New" w:cs="Courier New" w:hint="default"/>
+      </w:rPr>
+    </w:lvl>
+    <w:lvl w:ilvl="8" w:tplc="04090005" w:tentative="1">
+      <w:start w:val="1"/>
+      <w:numFmt w:val="bullet"/>
+      <w:lvlText w:val=""/>
+      <w:lvlJc w:val="left"/>
+      <w:pPr>
+        <w:ind w:left="6480" w:hanging="360"/>
+      </w:pPr>
+      <w:rPr>
+        <w:rFonts w:ascii="Wingdings" w:hAnsi="Wingdings" w:hint="default"/>
+      </w:rPr>
+    </w:lvl>
+  </w:abstractNum>
+  <w:abstractNum w:abstractNumId="3" w15:restartNumberingAfterBreak="0">
     <w:nsid w:val="22374674"/>
     <w:multiLevelType w:val="hybridMultilevel"/>
     <w:tmpl w:val="0CB84AAC"/>
@@ -1273,7 +2433,7 @@
       </w:rPr>
     </w:lvl>
   </w:abstractNum>
-  <w:abstractNum w:abstractNumId="2" w15:restartNumberingAfterBreak="0">
+  <w:abstractNum w:abstractNumId="4" w15:restartNumberingAfterBreak="0">
     <w:nsid w:val="38CA697A"/>
     <w:multiLevelType w:val="hybridMultilevel"/>
     <w:tmpl w:val="805A87A2"/>
@@ -1386,7 +2546,7 @@
       </w:rPr>
     </w:lvl>
   </w:abstractNum>
-  <w:abstractNum w:abstractNumId="3" w15:restartNumberingAfterBreak="0">
+  <w:abstractNum w:abstractNumId="5" w15:restartNumberingAfterBreak="0">
     <w:nsid w:val="5F033BEA"/>
     <w:multiLevelType w:val="hybridMultilevel"/>
     <w:tmpl w:val="8D48A2FE"/>
@@ -1500,16 +2660,22 @@
     </w:lvl>
   </w:abstractNum>
   <w:num w:numId="1" w16cid:durableId="706176641">
-    <w:abstractNumId w:val="2"/>
+    <w:abstractNumId w:val="4"/>
   </w:num>
   <w:num w:numId="2" w16cid:durableId="1814784546">
+    <w:abstractNumId w:val="5"/>
+  </w:num>
+  <w:num w:numId="3" w16cid:durableId="284502382">
+    <w:abstractNumId w:val="1"/>
+  </w:num>
+  <w:num w:numId="4" w16cid:durableId="985285039">
     <w:abstractNumId w:val="3"/>
   </w:num>
-  <w:num w:numId="3" w16cid:durableId="284502382">
+  <w:num w:numId="5" w16cid:durableId="1876038936">
     <w:abstractNumId w:val="0"/>
   </w:num>
-  <w:num w:numId="4" w16cid:durableId="985285039">
-    <w:abstractNumId w:val="1"/>
+  <w:num w:numId="6" w16cid:durableId="233901814">
+    <w:abstractNumId w:val="2"/>
   </w:num>
 </w:numbering>
 </file>
@@ -2465,7 +3631,6 @@
     <w:name w:val="Normal (Web)"/>
     <w:basedOn w:val="Normal"/>
     <w:uiPriority w:val="99"/>
-    <w:semiHidden/>
     <w:unhideWhenUsed/>
     <w:rsid w:val="005C7AE6"/>
     <w:pPr>
@@ -2476,6 +3641,25 @@
       <w:kern w:val="0"/>
       <w14:ligatures w14:val="none"/>
     </w:rPr>
+  </w:style>
+  <w:style w:type="table" w:styleId="TableGrid">
+    <w:name w:val="Table Grid"/>
+    <w:basedOn w:val="TableNormal"/>
+    <w:uiPriority w:val="39"/>
+    <w:rsid w:val="00784FA0"/>
+    <w:pPr>
+      <w:spacing w:after="0" w:line="240" w:lineRule="auto"/>
+    </w:pPr>
+    <w:tblPr>
+      <w:tblBorders>
+        <w:top w:val="single" w:sz="4" w:space="0" w:color="auto"/>
+        <w:left w:val="single" w:sz="4" w:space="0" w:color="auto"/>
+        <w:bottom w:val="single" w:sz="4" w:space="0" w:color="auto"/>
+        <w:right w:val="single" w:sz="4" w:space="0" w:color="auto"/>
+        <w:insideH w:val="single" w:sz="4" w:space="0" w:color="auto"/>
+        <w:insideV w:val="single" w:sz="4" w:space="0" w:color="auto"/>
+      </w:tblBorders>
+    </w:tblPr>
   </w:style>
 </w:styles>
 </file>

</xml_diff>